<commit_message>
Add team members and rename submission ZIP
Co-Authored-By: Claude Sonnet 5.5 <noreply@anthropic.com>
Claude-Session: https://claude.ai/code/session_01M5M144iMd7RpWX17kF67E6
</commit_message>
<xml_diff>
--- a/rag-mini-project/docs/project_report.docx
+++ b/rag-mini-project/docs/project_report.docx
@@ -64,7 +64,7 @@
           <w:i w:val="0"/>
           <w:sz w:val="23"/>
         </w:rPr>
-        <w:t>[Student Name 1]  -  Roll No. Rollno1</w:t>
+        <w:t>Aditri Shresth  -  Roll No. B099</w:t>
       </w:r>
     </w:p>
     <w:p>
@@ -77,7 +77,7 @@
           <w:i w:val="0"/>
           <w:sz w:val="23"/>
         </w:rPr>
-        <w:t>[Student Name 2]  -  Roll No. Rollno2</w:t>
+        <w:t>Aditya Singh  -  Roll No. B101</w:t>
       </w:r>
     </w:p>
     <w:p>
@@ -90,7 +90,7 @@
           <w:i w:val="0"/>
           <w:sz w:val="23"/>
         </w:rPr>
-        <w:t>[Student Name 3]  -  Roll No. Rollno3</w:t>
+        <w:t>Krishang Vikram Singh  -  Roll No. B106</w:t>
       </w:r>
     </w:p>
     <w:p>
@@ -128,7 +128,7 @@
           <w:i/>
           <w:sz w:val="18"/>
         </w:rPr>
-        <w:t>Names, roll numbers, institution, supervisor and date are placeholders to be completed by the team (docs/team_info.json).</w:t>
+        <w:t>Institution, supervisor and date are placeholders to be completed by the team (docs/team_info.json).</w:t>
       </w:r>
     </w:p>
     <w:p>

</xml_diff>

<commit_message>
Add institution and supervisor to title pages
Co-Authored-By: Claude Sonnet 5.5 <noreply@anthropic.com>
Claude-Session: https://claude.ai/code/session_01M5M144iMd7RpWX17kF67E6
</commit_message>
<xml_diff>
--- a/rag-mini-project/docs/project_report.docx
+++ b/rag-mini-project/docs/project_report.docx
@@ -51,7 +51,7 @@
           <w:i w:val="0"/>
           <w:sz w:val="24"/>
         </w:rPr>
-        <w:t>[Institution name]</w:t>
+        <w:t>NMIMS - Mukesh Patel School of Technology Management and Engineering</w:t>
       </w:r>
     </w:p>
     <w:p>
@@ -103,7 +103,7 @@
           <w:i w:val="0"/>
           <w:sz w:val="22"/>
         </w:rPr>
-        <w:t>Supervisor / Instructor: [Supervisor / Instructor name]</w:t>
+        <w:t>Supervisor / Instructor: Dr. Prashasti Kanikar</w:t>
       </w:r>
     </w:p>
     <w:p>
@@ -128,7 +128,7 @@
           <w:i/>
           <w:sz w:val="18"/>
         </w:rPr>
-        <w:t>Institution, supervisor and date are placeholders to be completed by the team (docs/team_info.json).</w:t>
+        <w:t>The submission date is a placeholder to be completed by the team (docs/team_info.json).</w:t>
       </w:r>
     </w:p>
     <w:p>

</xml_diff>